<commit_message>
Student guides: Movies guide covers today's changes; TV guide describes Why? boxes
Movies: required Logline, genre budget/screen hints and the P&A sweet spot,
genre-specific release strategies, presale as insurance, Pay-1 bid terms and
re-shopping, how to read Projected Range, and the 75/25 decisions/luck grade.

Co-Authored-By: Claude Opus 5.5 <noreply@anthropic.com>
</commit_message>
<xml_diff>
--- a/docs/The_Slate_Student_Guide_Movies.docx
+++ b/docs/The_Slate_Student_Guide_Movies.docx
@@ -152,14 +152,14 @@
                 <w:b/>
                 <w:sz w:val="20"/>
               </w:rPr>
-              <w:t>5 cycles</w:t>
+              <w:t>5 films, one per cycle.</w:t>
             </w:r>
             <w:r>
               <w:rPr>
                 <w:b w:val="0"/>
                 <w:sz w:val="20"/>
               </w:rPr>
-              <w:t>, each covering 2 years (year 1 = make the movie, year 2 = release it). That's 10 in-game years.</w:t>
+              <w:t xml:space="preserve"> Each cycle covers 2 years: the first year you greenlight and produce (your t = 0 investment), the second you release. That's 10 in-game years.</w:t>
             </w:r>
           </w:p>
         </w:tc>
@@ -1278,6 +1278,23 @@
         <w:rPr>
           <w:b/>
         </w:rPr>
+        <w:t>Logline (required)</w:t>
+      </w:r>
+      <w:r>
+        <w:rPr>
+          <w:b w:val="0"/>
+        </w:rPr>
+        <w:t>: 1–3 sentences on who the movie is about, what they want, and what's in the way. You can't Simulate without one.</w:t>
+      </w:r>
+    </w:p>
+    <w:p>
+      <w:pPr>
+        <w:pStyle w:val="ListBullet"/>
+      </w:pPr>
+      <w:r>
+        <w:rPr>
+          <w:b/>
+        </w:rPr>
         <w:t>Genre</w:t>
       </w:r>
       <w:r>
@@ -1360,7 +1377,19 @@
         <w:rPr>
           <w:b w:val="0"/>
         </w:rPr>
-        <w:t>: what it costs to make the movie.</w:t>
+        <w:t xml:space="preserve">: what it costs to make the movie. </w:t>
+      </w:r>
+      <w:r>
+        <w:rPr>
+          <w:b/>
+        </w:rPr>
+        <w:t>Budget buys quality.</w:t>
+      </w:r>
+      <w:r>
+        <w:rPr>
+          <w:b w:val="0"/>
+        </w:rPr>
+        <w:t xml:space="preserve"> A gold hint shows your genre's typical budget (about $150M for a tentpole, $15M for horror). Far below it, the film looks cheap and draws weaker audiences; above it, gains taper off.</w:t>
       </w:r>
     </w:p>
     <w:p>
@@ -1377,7 +1406,7 @@
         <w:rPr>
           <w:b w:val="0"/>
         </w:rPr>
-        <w:t>: prints and advertising. Marketing buys you an opening weekend, but it can't make a weak movie hold its audience.</w:t>
+        <w:t>: prints and advertising. With no marketing, almost nobody shows up; past a point, extra spending barely moves the opening. Finding that sweet spot is part of the job.</w:t>
       </w:r>
     </w:p>
     <w:p>
@@ -1394,7 +1423,7 @@
         <w:rPr>
           <w:b w:val="0"/>
         </w:rPr>
-        <w:t>: bigger stars mean a bigger opening.</w:t>
+        <w:t>: bigger stars mean a bigger opening, and they cost money.</w:t>
       </w:r>
     </w:p>
     <w:p>
@@ -1423,7 +1452,7 @@
         <w:rPr>
           <w:b w:val="0"/>
         </w:rPr>
-        <w:t>.</w:t>
+        <w:t>. A gold hint shows how many screens your genre's audience can fill. Booking more mostly adds empty seats.</w:t>
       </w:r>
     </w:p>
     <w:p>
@@ -1440,7 +1469,43 @@
         <w:rPr>
           <w:b w:val="0"/>
         </w:rPr>
-        <w:t>: Self-Finance (all the upside, all the risk), Pre-Sale (sell international rights early to cover about 40% of the budget, which means less risk but a smaller share of the profit), or Tax Incentive (shoot where a government rebate lowers your cost).</w:t>
+        <w:t xml:space="preserve">: </w:t>
+      </w:r>
+      <w:r>
+        <w:rPr>
+          <w:b/>
+        </w:rPr>
+        <w:t>Self-Finance</w:t>
+      </w:r>
+      <w:r>
+        <w:rPr>
+          <w:b w:val="0"/>
+        </w:rPr>
+        <w:t xml:space="preserve"> (all the upside, all the risk). </w:t>
+      </w:r>
+      <w:r>
+        <w:rPr>
+          <w:b/>
+        </w:rPr>
+        <w:t>Pre-Sale</w:t>
+      </w:r>
+      <w:r>
+        <w:rPr>
+          <w:b w:val="0"/>
+        </w:rPr>
+        <w:t xml:space="preserve">: distributors pay a guaranteed advance about equal to your expected international take; they recoup it first and you get half of anything beyond it. That's insurance: worth it for risky films like horror, a bad trade for a likely hit. </w:t>
+      </w:r>
+      <w:r>
+        <w:rPr>
+          <w:b/>
+        </w:rPr>
+        <w:t>Tax Incentive</w:t>
+      </w:r>
+      <w:r>
+        <w:rPr>
+          <w:b w:val="0"/>
+        </w:rPr>
+        <w:t>: shoot where a government rebate lowers your cost.</w:t>
       </w:r>
     </w:p>
     <w:p>
@@ -1542,7 +1607,19 @@
               <w:rPr>
                 <w:b w:val="0"/>
               </w:rPr>
-              <w:t xml:space="preserve"> chart (Bear / Base / Bull cases). If even the Base case is negative, rethink the budget.</w:t>
+              <w:t xml:space="preserve"> chart. Each Bear / Base / Bull bar is what the movie's revenue is worth today </w:t>
+            </w:r>
+            <w:r>
+              <w:rPr>
+                <w:b/>
+              </w:rPr>
+              <w:t>minus</w:t>
+            </w:r>
+            <w:r>
+              <w:rPr>
+                <w:b w:val="0"/>
+              </w:rPr>
+              <w:t xml:space="preserve"> Capital at Risk, so every extra $10M you commit pushes all three bars down about $10M unless the movie earns it back. The chart assumes a wide release and no reviews yet. If even the Base case is negative, rethink the plan.</w:t>
             </w:r>
           </w:p>
         </w:tc>
@@ -1658,7 +1735,7 @@
         <w:rPr>
           <w:b w:val="0"/>
         </w:rPr>
-        <w:t xml:space="preserve"> (from Cycle 3 on; Cycles 1–2 are Wide Theatrical only): </w:t>
+        <w:t xml:space="preserve"> (from Cycle 3 on; Cycles 1–2 are Wide Theatrical only). </w:t>
       </w:r>
       <w:r>
         <w:rPr>
@@ -1670,7 +1747,7 @@
         <w:rPr>
           <w:b w:val="0"/>
         </w:rPr>
-        <w:t xml:space="preserve">, </w:t>
+        <w:t xml:space="preserve"> suits tentpoles, sci-fi, and animation. </w:t>
       </w:r>
       <w:r>
         <w:rPr>
@@ -1682,7 +1759,7 @@
         <w:rPr>
           <w:b w:val="0"/>
         </w:rPr>
-        <w:t xml:space="preserve"> (start small and expand), or </w:t>
+        <w:t xml:space="preserve"> opens in about 600 theaters and expands on word of mouth; it's the strongest choice for drama and awards titles. </w:t>
       </w:r>
       <w:r>
         <w:rPr>
@@ -1694,7 +1771,7 @@
         <w:rPr>
           <w:b w:val="0"/>
         </w:rPr>
-        <w:t xml:space="preserve"> (theaters and Peacock at the same time; this gives up some box office).</w:t>
+        <w:t xml:space="preserve"> premieres in theaters and on Peacock together: it gives up box office, but a Peacock premiere is valuable in itself, so it can win for horror and comedy.</w:t>
       </w:r>
     </w:p>
     <w:p>
@@ -1742,7 +1819,7 @@
         <w:rPr>
           <w:b w:val="0"/>
         </w:rPr>
-        <w:t xml:space="preserve">: license the first streaming window for a flat fee, or click </w:t>
+        <w:t xml:space="preserve">: keep the first streaming window on Peacock, license it for a flat fee, or click </w:t>
       </w:r>
       <w:r>
         <w:rPr>
@@ -1754,7 +1831,31 @@
         <w:rPr>
           <w:b w:val="0"/>
         </w:rPr>
-        <w:t xml:space="preserve"> to let rival platforms bid, then accept the best offer.</w:t>
+        <w:t xml:space="preserve">. You can accept </w:t>
+      </w:r>
+      <w:r>
+        <w:rPr>
+          <w:b/>
+        </w:rPr>
+        <w:t>any</w:t>
+      </w:r>
+      <w:r>
+        <w:rPr>
+          <w:b w:val="0"/>
+        </w:rPr>
+        <w:t xml:space="preserve"> bid, not just the highest: each comes with a 12- or 18-month term, and a shorter term returns the movie to Peacock sooner, so a lower bid can be worth more. Don't like the offers? </w:t>
+      </w:r>
+      <w:r>
+        <w:rPr>
+          <w:b/>
+        </w:rPr>
+        <w:t>🔁 Reject All &amp; Take It Back to Market</w:t>
+      </w:r>
+      <w:r>
+        <w:rPr>
+          <w:b w:val="0"/>
+        </w:rPr>
+        <w:t xml:space="preserve"> once; the new bids usually come in lower.</w:t>
       </w:r>
     </w:p>
     <w:p>
@@ -1871,7 +1972,7 @@
               <w:rPr>
                 <w:b w:val="0"/>
               </w:rPr>
-              <w:t xml:space="preserve"> button stays greyed out until you've run the Theatrical Simulation and answered any PVOD rejection. If you can't click it, scroll up and look for the step you skipped.</w:t>
+              <w:t xml:space="preserve"> button stays greyed out until you've written a Logline, run the Theatrical Simulation, and answered any PVOD rejection. If you can't click it, scroll up and look for the step you skipped.</w:t>
             </w:r>
           </w:p>
         </w:tc>
@@ -2260,7 +2361,31 @@
         <w:rPr>
           <w:b w:val="0"/>
         </w:rPr>
-        <w:t xml:space="preserve"> means your slate's average risk-adjusted NPV is above $0.</w:t>
+        <w:t xml:space="preserve"> means your slate's average graded NPV is above $0. Each film's graded NPV is </w:t>
+      </w:r>
+      <w:r>
+        <w:rPr>
+          <w:b/>
+        </w:rPr>
+        <w:t>75% your decisions</w:t>
+      </w:r>
+      <w:r>
+        <w:rPr>
+          <w:b w:val="0"/>
+        </w:rPr>
+        <w:t xml:space="preserve"> (risk-adjusted, so the bear case counts) and </w:t>
+      </w:r>
+      <w:r>
+        <w:rPr>
+          <w:b/>
+        </w:rPr>
+        <w:t>25% luck</w:t>
+      </w:r>
+      <w:r>
+        <w:rPr>
+          <w:b w:val="0"/>
+        </w:rPr>
+        <w:t xml:space="preserve"> (what the film actually earned). A breakout helps and a flop hurts, but good decisions still matter most.</w:t>
       </w:r>
     </w:p>
     <w:tbl>
@@ -2395,7 +2520,7 @@
                 <w:b w:val="0"/>
                 <w:sz w:val="20"/>
               </w:rPr>
-              <w:t>Your movies create value after accounting for risk.</w:t>
+              <w:t>Your movies create value after accounting for risk (plus a little luck).</w:t>
             </w:r>
           </w:p>
         </w:tc>
@@ -2586,6 +2711,57 @@
       </w:pPr>
       <w:r>
         <w:t>Common mistakes</w:t>
+      </w:r>
+    </w:p>
+    <w:p>
+      <w:pPr>
+        <w:pStyle w:val="ListBullet"/>
+      </w:pPr>
+      <w:r>
+        <w:rPr>
+          <w:b/>
+        </w:rPr>
+        <w:t>Leaving the defaults alone.</w:t>
+      </w:r>
+      <w:r>
+        <w:rPr>
+          <w:b w:val="0"/>
+        </w:rPr>
+        <w:t xml:space="preserve"> The default film is an under-funded tentpole, and it loses money.</w:t>
+      </w:r>
+    </w:p>
+    <w:p>
+      <w:pPr>
+        <w:pStyle w:val="ListBullet"/>
+      </w:pPr>
+      <w:r>
+        <w:rPr>
+          <w:b/>
+        </w:rPr>
+        <w:t>A cheap blockbuster.</w:t>
+      </w:r>
+      <w:r>
+        <w:rPr>
+          <w:b w:val="0"/>
+        </w:rPr>
+        <w:t xml:space="preserve"> A $20M action film looks cheap and underperforms. Fund the genre properly.</w:t>
+      </w:r>
+    </w:p>
+    <w:p>
+      <w:pPr>
+        <w:pStyle w:val="ListBullet"/>
+      </w:pPr>
+      <w:r>
+        <w:rPr>
+          <w:b/>
+        </w:rPr>
+        <w:t>Maxing out P&amp;A or screens.</w:t>
+      </w:r>
+      <w:r>
+        <w:rPr>
+          <w:b w:val="0"/>
+        </w:rPr>
+        <w:t xml:space="preserve"> Past the genre's sweet spot you're paying for empty seats.</w:t>
       </w:r>
     </w:p>
     <w:p>

</xml_diff>

<commit_message>
Movies QA round 2: partnership copy matches renewals, honest theme-park line in Why, wider Release Plan cells, short Pay-2 labels
Co-Authored-By: Claude Opus 5.5 <noreply@anthropic.com>
</commit_message>
<xml_diff>
--- a/docs/The_Slate_Student_Guide_Movies.docx
+++ b/docs/The_Slate_Student_Guide_Movies.docx
@@ -2391,25 +2391,25 @@
         <w:rPr>
           <w:b/>
         </w:rPr>
-        <w:t>Keep (gamble)</w:t>
+        <w:t>🎲 Keep</w:t>
       </w:r>
       <w:r>
         <w:rPr>
           <w:b w:val="0"/>
         </w:rPr>
-        <w:t xml:space="preserve">: the film stays in Peacock's catalog and earns whatever its catalog life turns out to be; better reviews make it worth more, and the line under the table shows its expected value and likely range. </w:t>
+        <w:t xml:space="preserve"> (the gamble): the film stays in Peacock's catalog and earns whatever its catalog life turns out to be; better reviews make it worth more, and the line under the table shows its expected value and likely range. </w:t>
       </w:r>
       <w:r>
         <w:rPr>
           <w:b/>
         </w:rPr>
-        <w:t>License (sure)</w:t>
+        <w:t>✓ Amazon / ✓ Netflix</w:t>
       </w:r>
       <w:r>
         <w:rPr>
           <w:b w:val="0"/>
         </w:rPr>
-        <w:t xml:space="preserve">: a guaranteed fee from Amazon Prime Video or Netflix, whose offers change each cycle. Pick one, then click </w:t>
+        <w:t xml:space="preserve"> (the sure thing): a guaranteed fee from Amazon Prime Video or Netflix, whose offers change each cycle. Pick one, then click </w:t>
       </w:r>
       <w:r>
         <w:rPr>

</xml_diff>

<commit_message>
Docs: instructor plan festival note matches value-based pricing; student guide mentions the pinned panel and labelled chart
Co-Authored-By: Claude Opus 5.5 <noreply@anthropic.com>
</commit_message>
<xml_diff>
--- a/docs/The_Slate_Student_Guide_Movies.docx
+++ b/docs/The_Slate_Student_Guide_Movies.docx
@@ -1913,7 +1913,7 @@
               <w:rPr>
                 <w:b w:val="0"/>
               </w:rPr>
-              <w:t xml:space="preserve"> chart. It shows </w:t>
+              <w:t xml:space="preserve"> chart, pinned on the right so you can watch them change as you edit. The chart shows </w:t>
             </w:r>
             <w:r>
               <w:rPr>
@@ -1925,7 +1925,7 @@
               <w:rPr>
                 <w:b w:val="0"/>
               </w:rPr>
-              <w:t xml:space="preserve"> for this movie: </w:t>
+              <w:t xml:space="preserve">, each labelled with its dollar value, for this movie: </w:t>
             </w:r>
             <w:r>
               <w:rPr>
@@ -1961,7 +1961,7 @@
               <w:rPr>
                 <w:b w:val="0"/>
               </w:rPr>
-              <w:t xml:space="preserve"> (a breakout). Each point is that outcome's NPV: the movie's revenue in today's dollars </w:t>
+              <w:t xml:space="preserve"> (a breakout). Each is that outcome's NPV: the movie's revenue in today's dollars </w:t>
             </w:r>
             <w:r>
               <w:rPr>

</xml_diff>

<commit_message>
Movies: explicit Greenlight button ends step 4; Theatrical Simulation is a full-width button under the Release Plan (it rendered as an unreadable 'The...' in the table cell); Holding Deal buttons stacked so labels aren't cut off
Co-Authored-By: Claude Opus 5.5 <noreply@anthropic.com>
</commit_message>
<xml_diff>
--- a/docs/The_Slate_Student_Guide_Movies.docx
+++ b/docs/The_Slate_Student_Guide_Movies.docx
@@ -605,19 +605,19 @@
         <w:rPr>
           <w:b w:val="0"/>
         </w:rPr>
-        <w:t xml:space="preserve"> (step 6), click </w:t>
+        <w:t xml:space="preserve"> (step 6), click the big </w:t>
       </w:r>
       <w:r>
         <w:rPr>
           <w:b/>
         </w:rPr>
-        <w:t>🎬 Theatrical Sim</w:t>
+        <w:t>🎬 Run Theatrical Simulation</w:t>
       </w:r>
       <w:r>
         <w:rPr>
           <w:b w:val="0"/>
         </w:rPr>
-        <w:t>, then set PVOD and Pay-1 and choose Pay-2 for any earlier film that's due.</w:t>
+        <w:t xml:space="preserve"> button under the table, then set PVOD and Pay-1 and choose Pay-2 for any earlier film that's due.</w:t>
       </w:r>
     </w:p>
     <w:p>
@@ -2211,13 +2211,13 @@
         <w:rPr>
           <w:b/>
         </w:rPr>
-        <w:t>Click 🎬 Theatrical Sim</w:t>
+        <w:t>Click the big 🎬 Run Theatrical Simulation button</w:t>
       </w:r>
       <w:r>
         <w:rPr>
           <w:b w:val="0"/>
         </w:rPr>
-        <w:t xml:space="preserve"> in the Status column. This is required, and it locks in how the movie does in theaters, its reviews, and any surprises.</w:t>
+        <w:t xml:space="preserve"> right under the table. This is required, and it locks in how the movie does in theaters, its reviews, and any surprises.</w:t>
       </w:r>
     </w:p>
     <w:p>
@@ -3453,13 +3453,13 @@
         <w:rPr>
           <w:b/>
         </w:rPr>
-        <w:t>Forgetting the Theatrical Sim.</w:t>
+        <w:t>Forgetting the Theatrical Simulation.</w:t>
       </w:r>
       <w:r>
         <w:rPr>
           <w:b w:val="0"/>
         </w:rPr>
-        <w:t xml:space="preserve"> You can't Simulate until you've clicked 🎬 Theatrical Sim in the Release Plan table.</w:t>
+        <w:t xml:space="preserve"> You can't Simulate until you've clicked 🎬 Run Theatrical Simulation under the Release Plan table.</w:t>
       </w:r>
     </w:p>
     <w:p>

</xml_diff>

<commit_message>
Movies: industry context for Pay-1 (arms dealers vs in-house streamers, Universal's split window) and Pay-2 (near-pure profit) in the app and the student guide
Co-Authored-By: Claude Opus 5.5 <noreply@anthropic.com>
</commit_message>
<xml_diff>
--- a/docs/The_Slate_Student_Guide_Movies.docx
+++ b/docs/The_Slate_Student_Guide_Movies.docx
@@ -2343,97 +2343,25 @@
         <w:rPr>
           <w:b/>
         </w:rPr>
-        <w:t>Pay-2</w:t>
+        <w:t>Why the windows work this way:</w:t>
       </w:r>
       <w:r>
         <w:rPr>
           <w:b w:val="0"/>
         </w:rPr>
-        <w:t xml:space="preserve"> (second window, about 4 years after release): decided </w:t>
+        <w:t xml:space="preserve"> Pay-1 (about 18 months) is the first exclusive streaming window. Studios without a big streamer sell it (Sony licenses Pay-1 to Netflix); studios with one keep films in house (Disney+, Max, Paramount+). Universal sits in between: films start on Peacock, part of the window is licensed out, then they return. </w:t>
       </w:r>
       <w:r>
         <w:rPr>
           <w:b/>
         </w:rPr>
-        <w:t>the cycle after release</w:t>
+        <w:t>Pay-2</w:t>
       </w:r>
       <w:r>
         <w:rPr>
           <w:b w:val="0"/>
         </w:rPr>
-        <w:t xml:space="preserve">, when a </w:t>
-      </w:r>
-      <w:r>
-        <w:rPr>
-          <w:b/>
-        </w:rPr>
-        <w:t>⚠ Choose…</w:t>
-      </w:r>
-      <w:r>
-        <w:rPr>
-          <w:b w:val="0"/>
-        </w:rPr>
-        <w:t xml:space="preserve"> cell appears in that film's row. It's a </w:t>
-      </w:r>
-      <w:r>
-        <w:rPr>
-          <w:b/>
-        </w:rPr>
-        <w:t>gamble versus a sure thing</w:t>
-      </w:r>
-      <w:r>
-        <w:rPr>
-          <w:b w:val="0"/>
-        </w:rPr>
-        <w:t xml:space="preserve">. </w:t>
-      </w:r>
-      <w:r>
-        <w:rPr>
-          <w:b/>
-        </w:rPr>
-        <w:t>🎲 Keep</w:t>
-      </w:r>
-      <w:r>
-        <w:rPr>
-          <w:b w:val="0"/>
-        </w:rPr>
-        <w:t xml:space="preserve"> (the gamble): the film stays in Peacock's catalog and earns whatever its catalog life turns out to be; better reviews make it worth more, and the line under the table shows its expected value and likely range. </w:t>
-      </w:r>
-      <w:r>
-        <w:rPr>
-          <w:b/>
-        </w:rPr>
-        <w:t>✓ Amazon / ✓ Netflix</w:t>
-      </w:r>
-      <w:r>
-        <w:rPr>
-          <w:b w:val="0"/>
-        </w:rPr>
-        <w:t xml:space="preserve"> (the sure thing): a guaranteed fee from Amazon Prime Video or Netflix, whose offers change each cycle. Pick one, then click </w:t>
-      </w:r>
-      <w:r>
-        <w:rPr>
-          <w:b/>
-        </w:rPr>
-        <w:t>💼 Lock Pay-2</w:t>
-      </w:r>
-      <w:r>
-        <w:rPr>
-          <w:b w:val="0"/>
-        </w:rPr>
-        <w:t xml:space="preserve"> in the Status column. Locking is final and reveals Keep's outcome. On your </w:t>
-      </w:r>
-      <w:r>
-        <w:rPr>
-          <w:b/>
-        </w:rPr>
-        <w:t>final</w:t>
-      </w:r>
-      <w:r>
-        <w:rPr>
-          <w:b w:val="0"/>
-        </w:rPr>
-        <w:t xml:space="preserve"> film, you choose Pay-2 in its own row and the outcome is revealed at Simulate.</w:t>
+        <w:t xml:space="preserve"> comes after Pay-1, when production and P&amp;A were paid long ago, so a Pay-2 licence fee is almost pure, high-margin profit.</w:t>
       </w:r>
     </w:p>
     <w:p>
@@ -2446,6 +2374,114 @@
           <w:color w:val="1A6BB5"/>
         </w:rPr>
         <w:t xml:space="preserve">8.  </w:t>
+      </w:r>
+      <w:r>
+        <w:rPr>
+          <w:b/>
+        </w:rPr>
+        <w:t>Pay-2</w:t>
+      </w:r>
+      <w:r>
+        <w:rPr>
+          <w:b w:val="0"/>
+        </w:rPr>
+        <w:t xml:space="preserve"> (second window, about 4 years after release): decided </w:t>
+      </w:r>
+      <w:r>
+        <w:rPr>
+          <w:b/>
+        </w:rPr>
+        <w:t>the cycle after release</w:t>
+      </w:r>
+      <w:r>
+        <w:rPr>
+          <w:b w:val="0"/>
+        </w:rPr>
+        <w:t xml:space="preserve">, when a </w:t>
+      </w:r>
+      <w:r>
+        <w:rPr>
+          <w:b/>
+        </w:rPr>
+        <w:t>⚠ Choose…</w:t>
+      </w:r>
+      <w:r>
+        <w:rPr>
+          <w:b w:val="0"/>
+        </w:rPr>
+        <w:t xml:space="preserve"> cell appears in that film's row. It's a </w:t>
+      </w:r>
+      <w:r>
+        <w:rPr>
+          <w:b/>
+        </w:rPr>
+        <w:t>gamble versus a sure thing</w:t>
+      </w:r>
+      <w:r>
+        <w:rPr>
+          <w:b w:val="0"/>
+        </w:rPr>
+        <w:t xml:space="preserve">. </w:t>
+      </w:r>
+      <w:r>
+        <w:rPr>
+          <w:b/>
+        </w:rPr>
+        <w:t>🎲 Keep</w:t>
+      </w:r>
+      <w:r>
+        <w:rPr>
+          <w:b w:val="0"/>
+        </w:rPr>
+        <w:t xml:space="preserve"> (the gamble): the film stays in Peacock's catalog and earns whatever its catalog life turns out to be; better reviews make it worth more, and the line under the table shows its expected value and likely range. </w:t>
+      </w:r>
+      <w:r>
+        <w:rPr>
+          <w:b/>
+        </w:rPr>
+        <w:t>✓ Amazon / ✓ Netflix</w:t>
+      </w:r>
+      <w:r>
+        <w:rPr>
+          <w:b w:val="0"/>
+        </w:rPr>
+        <w:t xml:space="preserve"> (the sure thing): a guaranteed fee from Amazon Prime Video or Netflix, whose offers change each cycle. Pick one, then click </w:t>
+      </w:r>
+      <w:r>
+        <w:rPr>
+          <w:b/>
+        </w:rPr>
+        <w:t>💼 Lock Pay-2</w:t>
+      </w:r>
+      <w:r>
+        <w:rPr>
+          <w:b w:val="0"/>
+        </w:rPr>
+        <w:t xml:space="preserve"> in the Status column. Locking is final and reveals Keep's outcome. On your </w:t>
+      </w:r>
+      <w:r>
+        <w:rPr>
+          <w:b/>
+        </w:rPr>
+        <w:t>final</w:t>
+      </w:r>
+      <w:r>
+        <w:rPr>
+          <w:b w:val="0"/>
+        </w:rPr>
+        <w:t xml:space="preserve"> film, you choose Pay-2 in its own row and the outcome is revealed at Simulate.</w:t>
+      </w:r>
+    </w:p>
+    <w:p>
+      <w:pPr>
+        <w:ind w:left="504" w:hanging="432"/>
+      </w:pPr>
+      <w:r>
+        <w:rPr>
+          <w:b/>
+          <w:color w:val="1A6BB5"/>
+        </w:rPr>
+        <w:t xml:space="preserve">9.  </w:t>
       </w:r>
       <w:r>
         <w:rPr>

</xml_diff>

<commit_message>
Movies: only the pitch is required to Simulate; every other step optional
Per user: "students should be able to simulate without completing
everything." Partnerships, Scouted Concepts, Festivals, Holding Deals,
earlier-film Pay-2 and attraction calls are now optional (skipping = passing
on that deal; undecided Pay-2 still earns $0). Simulate auto-greenlights and
runs the Theatrical Simulation if the team hasn't. Skipped steps are listed
above the button as a reminder. Section labels, student guide and README
updated; old gating tests rewritten for the new rule. 542 tests pass.

Co-Authored-By: Claude Opus 5.5 <noreply@anthropic.com>
</commit_message>
<xml_diff>
--- a/docs/The_Slate_Student_Guide_Movies.docx
+++ b/docs/The_Slate_Student_Guide_Movies.docx
@@ -1146,13 +1146,13 @@
         <w:rPr>
           <w:b/>
         </w:rPr>
-        <w:t>Every step is required.</w:t>
+        <w:t>Only your pitch (logline) is required.</w:t>
       </w:r>
       <w:r>
         <w:rPr>
           <w:b w:val="0"/>
         </w:rPr>
-        <w:t xml:space="preserve"> The ▶ Simulate button stays locked until each one has a ✓, and the list under the button tells you exactly what's missing.</w:t>
+        <w:t xml:space="preserve"> Every other step is optional: skip it and you simply pass on that deal. The list above ▶ Simulate shows which steps you skipped, and Simulate greenlights the film and runs its Theatrical Simulation for you if you haven't.</w:t>
       </w:r>
     </w:p>
     <w:p>
@@ -1176,7 +1176,7 @@
         <w:pStyle w:val="Heading2"/>
       </w:pPr>
       <w:r>
-        <w:t>1 · Studio Partnerships  (required: sign, then renew or replace each cycle)</w:t>
+        <w:t>1 · Studio Partnerships  (optional: sign, then renew or replace each cycle)</w:t>
       </w:r>
     </w:p>
     <w:p>
@@ -1335,7 +1335,7 @@
         <w:pStyle w:val="Heading2"/>
       </w:pPr>
       <w:r>
-        <w:t>2 · Scouted Concepts  (required, option at least one)</w:t>
+        <w:t>2 · Scouted Concepts  (optional)</w:t>
       </w:r>
     </w:p>
     <w:p>
@@ -1379,7 +1379,7 @@
         <w:rPr>
           <w:b w:val="0"/>
         </w:rPr>
-        <w:t xml:space="preserve"> on at least one; it fills in your Greenlight form, and you can still change anything there. Ideas you skip may be made by a rival studio before the next cycle; one marked </w:t>
+        <w:t xml:space="preserve"> on one you like; it fills in your Greenlight form, and you can still change anything there. Ideas you skip may be made by a rival studio before the next cycle; one marked </w:t>
       </w:r>
       <w:r>
         <w:rPr>
@@ -1399,7 +1399,7 @@
         <w:pStyle w:val="Heading2"/>
       </w:pPr>
       <w:r>
-        <w:t>3 · Film Festival Acquisitions  (required, bid on at least one)</w:t>
+        <w:t>3 · Film Festival Acquisitions  (optional)</w:t>
       </w:r>
     </w:p>
     <w:p>
@@ -1463,7 +1463,7 @@
         <w:pStyle w:val="Heading2"/>
       </w:pPr>
       <w:r>
-        <w:t>4 · Greenlight a New Movie  (required, one slot per cycle)</w:t>
+        <w:t>4 · Greenlight a New Movie  (one slot per cycle)</w:t>
       </w:r>
     </w:p>
     <w:p>
@@ -2006,7 +2006,7 @@
         <w:pStyle w:val="Heading2"/>
       </w:pPr>
       <w:r>
-        <w:t>5 · Holding Deals  (required, except on your final film)</w:t>
+        <w:t>5 · Holding Deals  (optional)</w:t>
       </w:r>
     </w:p>
     <w:p>
@@ -2014,7 +2014,7 @@
         <w:rPr>
           <w:b w:val="0"/>
         </w:rPr>
-        <w:t xml:space="preserve">Lock at least one actor for your </w:t>
+        <w:t xml:space="preserve">Optionally lock an actor for your </w:t>
       </w:r>
       <w:r>
         <w:rPr>
@@ -2070,7 +2070,7 @@
         <w:pStyle w:val="Heading2"/>
       </w:pPr>
       <w:r>
-        <w:t>6 · Release Plan — Your Slate  (required)</w:t>
+        <w:t>6 · Release Plan — Your Slate</w:t>
       </w:r>
     </w:p>
     <w:p>
@@ -2306,7 +2306,7 @@
         <w:rPr>
           <w:b w:val="0"/>
         </w:rPr>
-        <w:t xml:space="preserve"> right under the table (it reads Run Release Simulation for a direct release). This is required, and it locks in how the movie does in theaters, its reviews, and any surprises.</w:t>
+        <w:t xml:space="preserve"> right under the table (it reads Run Release Simulation for a direct release). If you skip it, ▶ Simulate runs it for you. It locks in how the movie does in theaters, its reviews, and any surprises.</w:t>
       </w:r>
     </w:p>
     <w:p>
@@ -3578,13 +3578,13 @@
         <w:rPr>
           <w:b/>
         </w:rPr>
-        <w:t>Forgetting the Theatrical Simulation.</w:t>
+        <w:t>Skipping the Theatrical Simulation.</w:t>
       </w:r>
       <w:r>
         <w:rPr>
           <w:b w:val="0"/>
         </w:rPr>
-        <w:t xml:space="preserve"> You can't Simulate until you've clicked 🎬 Run Theatrical Simulation under the Release Plan table.</w:t>
+        <w:t xml:space="preserve"> Simulate will run it for you, but then you set PVOD and Pay-1 without seeing the opening first.</w:t>
       </w:r>
     </w:p>
     <w:p>
@@ -3595,13 +3595,13 @@
         <w:rPr>
           <w:b/>
         </w:rPr>
-        <w:t>Missing a required step.</w:t>
+        <w:t>No pitch.</w:t>
       </w:r>
       <w:r>
         <w:rPr>
           <w:b w:val="0"/>
         </w:rPr>
-        <w:t xml:space="preserve"> If ▶ Simulate is locked, check the step bar at the top for a step without a ✓.</w:t>
+        <w:t xml:space="preserve"> ▶ Simulate stays locked until you write your logline in step 4.</w:t>
       </w:r>
     </w:p>
     <w:p>

</xml_diff>

<commit_message>
Movies: explicit Save Pitch button with saved / not-saved status
Per user: "if there is a pitch made, we need a clear button to click so
that it is processed." Button under the pitch box (disabled while empty)
confirms "Pitch saved"; edited-but-unsaved text shows "Not saved yet".
Simulate still uses the current text, so nothing typed is lost. Guide
updated. 554 pass.

Co-Authored-By: Claude Opus 5.5 <noreply@anthropic.com>
</commit_message>
<xml_diff>
--- a/docs/The_Slate_Student_Guide_Movies.docx
+++ b/docs/The_Slate_Student_Guide_Movies.docx
@@ -1513,7 +1513,19 @@
         <w:rPr>
           <w:b w:val="0"/>
         </w:rPr>
-        <w:t xml:space="preserve">: 1–3 sentences on who the movie is about, what they want, and what's in the way. Once the film is made, the logline and how the film did appear on your class's </w:t>
+        <w:t xml:space="preserve">: 1–3 sentences on who the movie is about, what they want, and what's in the way. Click </w:t>
+      </w:r>
+      <w:r>
+        <w:rPr>
+          <w:b/>
+        </w:rPr>
+        <w:t>💾 Save Pitch</w:t>
+      </w:r>
+      <w:r>
+        <w:rPr>
+          <w:b w:val="0"/>
+        </w:rPr>
+        <w:t xml:space="preserve"> under the box (you'll see ✅ Pitch saved). Once the film is made, the logline and how the film did appear on your class's </w:t>
       </w:r>
       <w:r>
         <w:rPr>

</xml_diff>